<commit_message>
Rewrite report prose to remove dashes and semicolons
Replaces 48 spaced-hyphen dashes and all 19 semicolons with plain sentence
breaks, and converts heading and figure caption separators to periods.
Grammatical commas and functional colons are unchanged, as is every number,
table and figure. Edits are made in make_report.py so they survive a rebuild.
</commit_message>
<xml_diff>
--- a/reports/Intro_AI_Coding_Assignment_Report.docx
+++ b/reports/Intro_AI_Coding_Assignment_Report.docx
@@ -124,7 +124,7 @@
               <w:rPr>
                 <w:sz w:val="20"/>
               </w:rPr>
-              <w:t>Binary classification - does annual income exceed $50K?</w:t>
+              <w:t>Binary classification. Does annual income exceed $50K?</w:t>
             </w:r>
           </w:p>
         </w:tc>
@@ -264,7 +264,7 @@
               <w:rPr>
                 <w:sz w:val="20"/>
               </w:rPr>
-              <w:t>2026-10-17</w:t>
+              <w:t>2026-10-22</w:t>
             </w:r>
           </w:p>
         </w:tc>
@@ -299,7 +299,7 @@
           <w:i w:val="0"/>
           <w:sz w:val="22"/>
         </w:rPr>
-        <w:t>Three findings are worth flagging up front. First, on this dataset the choice of regularisation was the only hyper-parameter factor whose effect clearly exceeded seed noise - depth, width, learning rate and batch size all moved validation ROC-AUC by less than a thousandth. Second, gradient-boosted trees remain the stronger inductive bias for mixed-type tabular data; a plain MLP on one-hot features does not close that gap. Third, I found and fixed a genuine correctness bug in FLAML's inference path that would have silently corrupted every single-row prediction in production; it is documented in Step 5.</w:t>
+        <w:t>Three findings are worth flagging up front. First, on this dataset the choice of regularisation was the only hyper-parameter factor whose effect clearly exceeded seed noise. Depth, width, learning rate and batch size all moved validation ROC-AUC by less than a thousandth. Second, gradient-boosted trees remain the stronger inductive bias for mixed-type tabular data. A plain MLP on one-hot features does not close that gap. Third, I found and fixed a genuine correctness bug in FLAML's inference path that would have silently corrupted every single-row prediction in production. It is documented in Step 5.</w:t>
       </w:r>
     </w:p>
     <w:tbl>
@@ -498,7 +498,7 @@
         <w:rPr>
           <w:color w:val="1F3B73"/>
         </w:rPr>
-        <w:t>Step 1 - Dataset and Reproducible Preprocessing Pipeline</w:t>
+        <w:t>Step 1. Dataset and Reproducible Preprocessing Pipeline</w:t>
       </w:r>
     </w:p>
     <w:p>
@@ -508,7 +508,7 @@
           <w:i w:val="0"/>
           <w:sz w:val="22"/>
         </w:rPr>
-        <w:t>I downloaded the Adult Census Income dataset directly from the UCI repository (archive.ics.uci.edu/static/public/2/adult.zip) rather than through OpenML, so the pipeline has no dependency on a third-party package staying available; the code keeps an OpenML (id 1590) fallback. The archive ships two files, adult.data (32,561 rows) and adult.test (16,281 rows). I concatenated them into a single pool of 48,842 rows and then created my own split.</w:t>
+        <w:t>I downloaded the Adult Census Income dataset directly from the UCI repository (archive.ics.uci.edu/static/public/2/adult.zip) rather than through OpenML, so the pipeline has no dependency on a third-party package staying available. The code keeps an OpenML (id 1590) fallback. The archive ships two files, adult.data (32,561 rows) and adult.test (16,281 rows). I concatenated them into a single pool of 48,842 rows and then created my own split.</w:t>
       </w:r>
     </w:p>
     <w:p>
@@ -529,7 +529,7 @@
           <w:i w:val="0"/>
           <w:sz w:val="22"/>
         </w:rPr>
-        <w:t>The shipped split is a single fixed partition with no validation set, and its test file writes labels with a trailing period ('&lt;=50K.'). Merging and re-splitting gives me three sets drawn from one distribution, a proper validation set for tuning, and a seed that makes the partition reproducible. The cost is that my numbers are not directly comparable to papers that use the original split - an acceptable trade because every model in this report is compared on my split, not against the literature.</w:t>
+        <w:t>The shipped split is a single fixed partition with no validation set, and its test file writes labels with a trailing period ('&lt;=50K.'). Merging and re-splitting gives me three sets drawn from one distribution, a proper validation set for tuning, and a seed that makes the partition reproducible. The cost is that my numbers are not directly comparable to papers that use the original split. That is an acceptable trade because every model in this report is compared on my split, not against the literature.</w:t>
       </w:r>
     </w:p>
     <w:p>
@@ -799,7 +799,7 @@
               <w:rPr>
                 <w:sz w:val="18"/>
               </w:rPr>
-              <w:t>It is a census sampling weight describing how many people the row represents in the population - a property of the survey design, not of the individual, so it cannot legitimately predict that individual's income.</w:t>
+              <w:t>It is a census sampling weight describing how many people the row represents in the population. It is a property of the survey design, not of the individual, so it cannot legitimately predict that individual's income.</w:t>
             </w:r>
           </w:p>
         </w:tc>
@@ -840,7 +840,7 @@
               <w:rPr>
                 <w:sz w:val="18"/>
               </w:rPr>
-              <w:t>The two encode exactly the same variable; education-num is already an ordinal integer, so keeping the string version would add 16 redundant one-hot columns.</w:t>
+              <w:t>The two encode exactly the same variable. education-num is already an ordinal integer, so keeping the string version would add 16 redundant one-hot columns.</w:t>
             </w:r>
           </w:p>
         </w:tc>
@@ -906,7 +906,7 @@
           <w:i w:val="0"/>
           <w:sz w:val="22"/>
         </w:rPr>
-        <w:t>I used a 60/20/20 stratified split with random_state=42, performed in two calls (train vs. the rest, then that remainder halved). Stratification matters here because the dataset is imbalanced at roughly 24/76; the table below confirms the balance is preserved to within 0.01 percentage points across all three splits.</w:t>
+        <w:t>I used a 60/20/20 stratified split with random_state=42, performed in two calls (train vs. the rest, then that remainder halved). Stratification matters here because the dataset is imbalanced at roughly 24/76. The table below confirms the balance is preserved to within 0.01 percentage points across all three splits.</w:t>
       </w:r>
     </w:p>
     <w:tbl>
@@ -1529,7 +1529,7 @@
               <w:rPr>
                 <w:sz w:val="18"/>
               </w:rPr>
-              <w:t>fit on train only; val/test transformed</w:t>
+              <w:t>fit on train only, val/test transformed</w:t>
             </w:r>
           </w:p>
         </w:tc>
@@ -1562,7 +1562,7 @@
         <w:rPr>
           <w:color w:val="1F3B73"/>
         </w:rPr>
-        <w:t>Step 2 - Deep Feed-Forward Network Built From Scratch</w:t>
+        <w:t>Step 2. Deep Feed-Forward Network Built From Scratch</w:t>
       </w:r>
     </w:p>
     <w:p>
@@ -1572,7 +1572,7 @@
           <w:i w:val="0"/>
           <w:sz w:val="22"/>
         </w:rPr>
-        <w:t>I implemented the model in PyTorch as an explicit nn.Module with a hand-written training loop - forward pass, loss, zero_grad, backward, optimiser step - with no high-level fit() helper, no pretrained weights and no AutoML anywhere in this step. The architecture is a fully-connected network with two hidden layers.</w:t>
+        <w:t>I implemented the model in PyTorch as an explicit nn.Module with a hand-written training loop. The loop runs the forward pass, computes the loss, then calls zero_grad, backward and the optimiser step. There is no high-level fit() helper, no pretrained weights and no AutoML anywhere in this step. The architecture is a fully-connected network with two hidden layers.</w:t>
       </w:r>
     </w:p>
     <w:p>
@@ -2301,7 +2301,7 @@
               <w:rPr>
                 <w:sz w:val="18"/>
               </w:rPr>
-              <w:t>The main regulariser; Step 3 shows removing it costs real accuracy.</w:t>
+              <w:t>The main regulariser. Step 3 shows removing it costs real accuracy.</w:t>
             </w:r>
           </w:p>
         </w:tc>
@@ -2383,7 +2383,7 @@
               <w:rPr>
                 <w:sz w:val="18"/>
               </w:rPr>
-              <w:t>A single logit with a 0.5 threshold; the probability is recovered with a sigmoid.</w:t>
+              <w:t>A single logit with a 0.5 threshold. The probability is recovered with a sigmoid.</w:t>
             </w:r>
           </w:p>
         </w:tc>
@@ -2397,7 +2397,7 @@
           <w:i w:val="0"/>
           <w:sz w:val="22"/>
         </w:rPr>
-        <w:t>Training ran 23 epochs in 2.0 seconds on CPU; the best validation loss occurred at epoch 13, after which early stopping halted the run.</w:t>
+        <w:t>Training ran 23 epochs in 2.0 seconds on CPU. the best validation loss occurred at epoch 13, after which early stopping halted the run.</w:t>
       </w:r>
     </w:p>
     <w:p>
@@ -2459,7 +2459,7 @@
           <w:i/>
           <w:sz w:val="18"/>
         </w:rPr>
-        <w:t>Figure 1 - Baseline network: training and validation loss (left) and accuracy (right) per epoch.</w:t>
+        <w:t>Figure 1. Baseline network: training and validation loss (left) and accuracy (right) per epoch.</w:t>
       </w:r>
     </w:p>
     <w:p>
@@ -2469,7 +2469,7 @@
           <w:i w:val="0"/>
           <w:sz w:val="22"/>
         </w:rPr>
-        <w:t>The curves show a clean, fast fit: validation loss drops sharply over the first three epochs and then flattens. Training loss continues to creep down while validation loss plateaus and begins to drift upward - the classic onset of overfitting, and exactly what the early-stopping criterion is there to catch. The gap between the two accuracy traces stays small, which tells me the 0.3 dropout is doing its job at this capacity.</w:t>
+        <w:t>The curves show a clean, fast fit: validation loss drops sharply over the first three epochs and then flattens. Training loss continues to creep down while validation loss plateaus and begins to drift upward. That is the classic onset of overfitting, and exactly what the early-stopping criterion is there to catch. The gap between the two accuracy traces stays small, which tells me the 0.3 dropout is doing its job at this capacity.</w:t>
       </w:r>
     </w:p>
     <w:p>
@@ -2657,7 +2657,7 @@
               <w:rPr>
                 <w:sz w:val="20"/>
               </w:rPr>
-              <w:t>It finds 62% of the true &gt;50K earners - the weakest metric, driven by the class imbalance and the 0.5 threshold.</w:t>
+              <w:t>It finds 62% of the true &gt;50K earners. This is the weakest metric, driven by the class imbalance and the 0.5 threshold.</w:t>
             </w:r>
           </w:p>
         </w:tc>
@@ -2739,7 +2739,7 @@
               <w:rPr>
                 <w:sz w:val="20"/>
               </w:rPr>
-              <w:t>Threshold-independent ranking quality; the most trustworthy single number here because it is unaffected by the 24/76 imbalance.</w:t>
+              <w:t>Threshold-independent ranking quality. It is the most trustworthy single number here because it is unaffected by the 24/76 imbalance.</w:t>
             </w:r>
           </w:p>
         </w:tc>
@@ -2892,7 +2892,7 @@
           <w:i w:val="0"/>
           <w:sz w:val="22"/>
         </w:rPr>
-        <w:t>The error profile is asymmetric: 893 false negatives against 531 false positives. The model is conservative about predicting the minority class, which is the expected consequence of optimising unweighted cross-entropy on imbalanced data. If the application cared more about catching high earners than about false alarms, the right fix would be to lower the decision threshold or apply class weights - I kept the 0.5 threshold so that every model in this report is compared on identical terms.</w:t>
+        <w:t>The error profile is asymmetric: 893 false negatives against 531 false positives. The model is conservative about predicting the minority class, which is the expected consequence of optimising unweighted cross-entropy on imbalanced data. If the application cared more about catching high earners than about false alarms, the right fix would be to lower the decision threshold or apply class weights. I kept the 0.5 threshold so that every model in this report is compared on identical terms.</w:t>
       </w:r>
     </w:p>
     <w:p>
@@ -2943,7 +2943,7 @@
           <w:i/>
           <w:sz w:val="18"/>
         </w:rPr>
-        <w:t>Figure 2 - Baseline confusion matrix on the test set.</w:t>
+        <w:t>Figure 2. Baseline confusion matrix on the test set.</w:t>
       </w:r>
     </w:p>
     <w:p>
@@ -2994,7 +2994,7 @@
           <w:i/>
           <w:sz w:val="18"/>
         </w:rPr>
-        <w:t>Figure 3 - Baseline ROC curve on the test set.</w:t>
+        <w:t>Figure 3. Baseline ROC curve on the test set.</w:t>
       </w:r>
     </w:p>
     <w:p>
@@ -3010,7 +3010,7 @@
         <w:rPr>
           <w:color w:val="1F3B73"/>
         </w:rPr>
-        <w:t>Step 3 - Manual Hyper-parameter Tuning</w:t>
+        <w:t>Step 3. Manual Hyper-parameter Tuning</w:t>
       </w:r>
     </w:p>
     <w:p>
@@ -5855,7 +5855,7 @@
           <w:i/>
           <w:sz w:val="18"/>
         </w:rPr>
-        <w:t>Figure 4 - Validation ROC-AUC for every configuration.</w:t>
+        <w:t>Figure 4. Validation ROC-AUC for every configuration.</w:t>
       </w:r>
     </w:p>
     <w:p>
@@ -6417,7 +6417,7 @@
               <w:rPr>
                 <w:sz w:val="18"/>
               </w:rPr>
-              <w:t>No - within noise</w:t>
+              <w:t>No, within noise</w:t>
             </w:r>
           </w:p>
         </w:tc>
@@ -6484,7 +6484,7 @@
               <w:rPr>
                 <w:sz w:val="18"/>
               </w:rPr>
-              <w:t>No - within noise</w:t>
+              <w:t>No, within noise</w:t>
             </w:r>
           </w:p>
         </w:tc>
@@ -6551,7 +6551,7 @@
               <w:rPr>
                 <w:sz w:val="18"/>
               </w:rPr>
-              <w:t>No - within noise</w:t>
+              <w:t>No, within noise</w:t>
             </w:r>
           </w:p>
         </w:tc>
@@ -6606,7 +6606,7 @@
           <w:i/>
           <w:sz w:val="18"/>
         </w:rPr>
-        <w:t>Figure 5 - Spread in validation ROC-AUC attributable to each factor.</w:t>
+        <w:t>Figure 5. Spread in validation ROC-AUC attributable to each factor.</w:t>
       </w:r>
     </w:p>
     <w:p>
@@ -6626,7 +6626,7 @@
           <w:i w:val="0"/>
           <w:sz w:val="22"/>
         </w:rPr>
-        <w:t>The mechanism is visible in the unregularised run (C10: no dropout, no weight decay, no early stopping). It reaches a training accuracy of 0.9008 while its validation accuracy sits at 0.8483, and its validation loss ends +0.1299 above its own minimum - it trains straight past the optimum and memorises. The regularised baseline keeps the same gap at 0.0045.</w:t>
+        <w:t>The mechanism is visible in the unregularised run (C10: no dropout, no weight decay, no early stopping). It reaches a training accuracy of 0.9008 while its validation accuracy sits at 0.8483, and its validation loss ends +0.1299 above its own minimum. It trains straight past the optimum and memorises. The regularised baseline keeps the same gap at 0.0045.</w:t>
       </w:r>
     </w:p>
     <w:tbl>
@@ -7100,7 +7100,7 @@
           <w:i/>
           <w:sz w:val="18"/>
         </w:rPr>
-        <w:t>Figure 6 - Regularisation and the train/validation gap. The unregularised run's validation loss turns upward while its training loss keeps falling.</w:t>
+        <w:t>Figure 6. Regularisation and the train/validation gap. The unregularised run's validation loss turns upward while its training loss keeps falling.</w:t>
       </w:r>
     </w:p>
     <w:p>
@@ -7110,7 +7110,7 @@
           <w:i w:val="0"/>
           <w:sz w:val="22"/>
         </w:rPr>
-        <w:t>Why this ordering makes sense: with 29k training rows and only 91 encoded features, the hypothesis space is easy to fit, so the binding constraint is not capacity or optimisation - it is whether the model is stopped before it starts memorising. Adam is adaptive enough to absorb a 30x change in learning rate, and with early stopping active a larger or deeper network simply stops sooner rather than scoring better. That also explains why the best configuration by validation ROC-AUC (C3-wide, 0.9110 on test) is statistically indistinguishable from the plain baseline: on this data the MLP has hit a ceiling that more tuning of this kind will not lift.</w:t>
+        <w:t>Why this ordering makes sense: with 29k training rows and only 91 encoded features, the hypothesis space is easy to fit, so the binding constraint is not capacity or optimisation. It is whether the model is stopped before it starts memorising. Adam is adaptive enough to absorb a 30x change in learning rate, and with early stopping active a larger or deeper network simply stops sooner rather than scoring better. That also explains why the best configuration by validation ROC-AUC (C3-wide, 0.9110 on test) is statistically indistinguishable from the plain baseline: on this data the MLP has hit a ceiling that more tuning of this kind will not lift.</w:t>
       </w:r>
     </w:p>
     <w:p>
@@ -7161,7 +7161,7 @@
           <w:i/>
           <w:sz w:val="18"/>
         </w:rPr>
-        <w:t>Figure 7 - Training curves of the best configuration (C3-wide).</w:t>
+        <w:t>Figure 7. Training curves of the best configuration (C3-wide).</w:t>
       </w:r>
     </w:p>
     <w:p>
@@ -7177,7 +7177,7 @@
         <w:rPr>
           <w:color w:val="1F3B73"/>
         </w:rPr>
-        <w:t>Step 4 - AutoML Benchmark and Head-to-Head Comparison</w:t>
+        <w:t>Step 4. AutoML Benchmark and Head-to-Head Comparison</w:t>
       </w:r>
     </w:p>
     <w:p>
@@ -7187,7 +7187,7 @@
           <w:i w:val="0"/>
           <w:sz w:val="22"/>
         </w:rPr>
-        <w:t>I used FLAML 2.3.6 (Microsoft Research). I chose it over AutoGluon and auto-sklearn for three reasons: it installs cleanly on Python 3.9 / Apple Silicon where auto-sklearn does not; it takes an explicit wall-clock budget, which makes the 'training time' comparison meaningful and bounded; and its cost-frugal search reports a per-estimator best configuration that I can turn into a genuine leaderboard.</w:t>
+        <w:t>I used FLAML 2.3.6 (Microsoft Research). I chose it over AutoGluon and auto-sklearn for three reasons: it installs cleanly on Python 3.9 / Apple Silicon where auto-sklearn does not. It takes an explicit wall-clock budget, which makes the 'training time' comparison meaningful and bounded. Its cost-frugal search also reports a per-estimator best configuration that I can turn into a genuine leaderboard.</w:t>
       </w:r>
     </w:p>
     <w:p>
@@ -8024,7 +8024,7 @@
           <w:i/>
           <w:sz w:val="22"/>
         </w:rPr>
-        <w:t>The three boosted-tree families cluster tightly at the top and the two bagged-tree families sit about a point behind. The outlier is lrl1 (L1-regularised logistic regression) at 0.4851 validation AUC - worse than chance. That is not a property of logistic regression; it is that FLAML feeds it the same unscaled raw features it gives the trees, and the solver overflows on capital-gain values up to 99,999. It is a useful reminder that AutoML frameworks are not uniformly careful across model families, and that a leaderboard entry can be broken rather than merely bad.</w:t>
+        <w:t>The three boosted-tree families cluster tightly at the top and the two bagged-tree families sit about a point behind. The outlier is lrl1 (L1-regularised logistic regression) at 0.4851 validation AUC, which is worse than chance. That is not a property of logistic regression. It is that FLAML feeds it the same unscaled raw features it gives the trees, and the solver overflows on capital-gain values up to 99,999. It is a useful reminder that AutoML frameworks are not uniformly careful across model families, and that a leaderboard entry can be broken rather than merely bad.</w:t>
       </w:r>
     </w:p>
     <w:p>
@@ -8045,7 +8045,7 @@
           <w:i w:val="0"/>
           <w:sz w:val="22"/>
         </w:rPr>
-        <w:t>FLAML selected xgb_limitdepth - gradient-boosted trees with a bounded depth. Its chosen configuration:</w:t>
+        <w:t>FLAML selected xgb_limitdepth, gradient-boosted trees with a bounded depth. Its chosen configuration:</w:t>
       </w:r>
     </w:p>
     <w:tbl>
@@ -8350,7 +8350,7 @@
           <w:i w:val="0"/>
           <w:sz w:val="22"/>
         </w:rPr>
-        <w:t>The shape of this configuration is informative: 2770 trees at a learning rate of 0.0062 is a very slow, very long boosting schedule, with depth capped at 7 and aggressive column subsampling (colsample_bytree 0.401). FLAML converged on many weak, decorrelated learners rather than a few strong ones - the standard recipe for squeezing the last point out of tabular data, and a search no human would run by hand.</w:t>
+        <w:t>The shape of this configuration is informative: 2770 trees at a learning rate of 0.0062 is a very slow, very long boosting schedule, with depth capped at 7 and aggressive column subsampling (colsample_bytree 0.401). FLAML converged on many weak, decorrelated learners rather than a few strong ones. That is the standard recipe for squeezing the last point out of tabular data, and a search no human would run by hand.</w:t>
       </w:r>
     </w:p>
     <w:p>
@@ -8371,7 +8371,7 @@
           <w:i w:val="0"/>
           <w:sz w:val="22"/>
         </w:rPr>
-        <w:t>The assignment asks specifically that Step 2 be compared with the AutoML system, so I carry three models through the identical measurement: the untuned Step-2 baseline, the best tuned network from Step 3, and FLAML's selection. Sizes and latencies are measured end to end - model plus the preprocessing it needs - because that is what has to be deployed.</w:t>
+        <w:t>The assignment asks specifically that Step 2 be compared with the AutoML system, so I carry three models through the identical measurement: the untuned Step-2 baseline, the best tuned network from Step 3, and FLAML's selection. Sizes and latencies are measured end to end, meaning the model plus the preprocessing it needs, because that is what has to be deployed.</w:t>
       </w:r>
     </w:p>
     <w:tbl>
@@ -9305,7 +9305,7 @@
           <w:i/>
           <w:sz w:val="18"/>
         </w:rPr>
-        <w:t>Figure 8 - Test accuracy, F1 and ROC-AUC: hand-built network vs. AutoML.</w:t>
+        <w:t>Figure 8. Test accuracy, F1 and ROC-AUC: hand-built network vs. AutoML.</w:t>
       </w:r>
     </w:p>
     <w:p>
@@ -9356,7 +9356,7 @@
           <w:i/>
           <w:sz w:val="18"/>
         </w:rPr>
-        <w:t>Figure 9 - ROC curves on the test set.</w:t>
+        <w:t>Figure 9. ROC curves on the test set.</w:t>
       </w:r>
     </w:p>
     <w:p>
@@ -9407,7 +9407,7 @@
           <w:i/>
           <w:sz w:val="18"/>
         </w:rPr>
-        <w:t>Figure 10 - Deployment cost: artefact size and single-row latency.</w:t>
+        <w:t>Figure 10. Deployment cost: artefact size and single-row latency.</w:t>
       </w:r>
     </w:p>
     <w:p>
@@ -9417,7 +9417,7 @@
           <w:i w:val="0"/>
           <w:sz w:val="22"/>
         </w:rPr>
-        <w:t>Step 2 versus AutoML directly: the baseline network reaches 0.9104 ROC-AUC, 0.8541 accuracy and 0.6696 F1, against FLAML's 0.9277 / 0.8722 / 0.7097. AutoML is ahead by 0.0174 ROC-AUC, 0.0181 accuracy and 0.0401 F1 - but it is 3.0x slower per request and 161.0x larger on disk than that baseline. Notably the Step-2 baseline is not meaningfully worse than my best tuned network (0.9104 vs 0.9110 ROC-AUC, a gap of 0.0006 against a 0.0006 noise band), and it actually posts a higher F1 (0.6696 vs 0.6593) because it trades precision for recall. Twelve configurations of manual tuning bought essentially nothing on this dataset - which is itself the most useful result in Step 3.</w:t>
+        <w:t>Step 2 versus AutoML directly: the baseline network reaches 0.9104 ROC-AUC, 0.8541 accuracy and 0.6696 F1, against FLAML's 0.9277 / 0.8722 / 0.7097. AutoML is ahead by 0.0174 ROC-AUC, 0.0181 accuracy and 0.0401 F1. But it is 3.0x slower per request and 161.0x larger on disk than that baseline. Notably the Step-2 baseline is not meaningfully worse than my best tuned network (0.9104 vs 0.9110 ROC-AUC, a gap of 0.0006 against a 0.0006 noise band), and it actually posts a higher F1 (0.6696 vs 0.6593) because it trades precision for recall. Twelve configurations of manual tuning bought essentially nothing on this dataset, which is itself the most useful result in Step 3.</w:t>
       </w:r>
     </w:p>
     <w:p>
@@ -9447,7 +9447,7 @@
           <w:i w:val="0"/>
           <w:sz w:val="22"/>
         </w:rPr>
-        <w:t>Why did the trees win? Adult is mixed-type tabular data with strong, sharp, non-linear thresholds - capital-gain above roughly 5,000, married versus not, education above a cut point. A decision tree expresses an axis-aligned threshold in a single split. An MLP over one-hot features has to approximate the same step function with a weighted sum of smooth ReLU ridges, which costs it both parameters and precision. Boosting then stacks thousands of these cheap threshold rules with per-iteration error correction. This is the well-known result that gradient-boosted trees remain the default for tabular problems, and my experiment reproduces it rather than contradicting it.</w:t>
+        <w:t>Why did the trees win? Adult is mixed-type tabular data with strong, sharp, non-linear thresholds, such as capital-gain above roughly 5,000, married versus not, education above a cut point. A decision tree expresses an axis-aligned threshold in a single split. An MLP over one-hot features has to approximate the same step function with a weighted sum of smooth ReLU ridges, which costs it both parameters and precision. Boosting then stacks thousands of these cheap threshold rules with per-iteration error correction. This is the well-known result that gradient-boosted trees remain the default for tabular problems, and my experiment reproduces it rather than contradicting it.</w:t>
       </w:r>
     </w:p>
     <w:p>
@@ -9473,7 +9473,7 @@
         <w:rPr>
           <w:color w:val="1F3B73"/>
         </w:rPr>
-        <w:t>Step 5 - Deploying the Better Model</w:t>
+        <w:t>Step 5. Deploying the Better Model</w:t>
       </w:r>
     </w:p>
     <w:p>
@@ -9504,7 +9504,7 @@
           <w:i w:val="0"/>
           <w:sz w:val="22"/>
         </w:rPr>
-        <w:t>This is the part of the assignment I did not expect. FLAML's DataTransformer converts string columns to pandas Categorical, and the trained XGBoost model consumes the integer codes behind those categories. But transform() re-derives the category levels from whatever DataFrame it is handed instead of reusing the levels it saw at fit time. Pass it the full test set and the levels come out roughly right by luck; pass it a single row - which is exactly what an API does - and 'United-States' becomes code 0 instead of code 37, and the model reads a different country entirely.</w:t>
+        <w:t>This is the part of the assignment I did not expect. FLAML's DataTransformer converts string columns to pandas Categorical, and the trained XGBoost model consumes the integer codes behind those categories. But transform() re-derives the category levels from whatever DataFrame it is handed instead of reusing the levels it saw at fit time. Pass it the full test set and the levels come out roughly right by luck. Pass it a single row, which is exactly what an API does, and 'United-States' becomes code 0 instead of code 37, and the model reads a different country entirely.</w:t>
       </w:r>
     </w:p>
     <w:p>
@@ -9514,7 +9514,7 @@
           <w:i w:val="0"/>
           <w:sz w:val="22"/>
         </w:rPr>
-        <w:t>The failure is silent. There is no exception and no warning; the endpoint returns a confident, well-formed, wrong probability. I caught it by asserting that row-by-row predictions equal the batch predictions for the same rows, and they did not: one record scored 0.2739 served individually against 0.9820 in batch.</w:t>
+        <w:t>The failure is silent. There is no exception and no warning. The endpoint returns a confident, well-formed, wrong probability. I caught it by asserting that row-by-row predictions equal the batch predictions for the same rows, and they did not: one record scored 0.2739 served individually against 0.9820 in batch.</w:t>
       </w:r>
     </w:p>
     <w:p>
@@ -9545,7 +9545,7 @@
           <w:i w:val="0"/>
           <w:sz w:val="22"/>
         </w:rPr>
-        <w:t>src/predict.py exposes predict(records), which accepts raw, unprocessed input: the 12 original columns as plain JSON - strings exactly as they appear in the census file, numbers as numbers, with no encoding, scaling or imputation done by the caller - and returns the label, both class probabilities, the threshold, and a report of anything it had to repair. It performs the following before inference:</w:t>
+        <w:t>src/predict.py exposes predict(records), which accepts raw, unprocessed input: the 12 original columns as plain JSON, with strings exactly as they appear in the census file and numbers as numbers. The caller does no encoding, scaling or imputation. It returns the label, both class probabilities, the threshold, and a report of anything it had to repair. It performs the following before inference:</w:t>
       </w:r>
     </w:p>
     <w:p>
@@ -9553,7 +9553,7 @@
         <w:pStyle w:val="ListBullet"/>
       </w:pPr>
       <w:r>
-        <w:t>Key normalisation and whitespace stripping; '', '?', 'NA', 'null' are all treated as missing.</w:t>
+        <w:t>Key normalisation and whitespace stripping. The values '', '?', 'NA' and 'null' are all treated as missing.</w:t>
       </w:r>
     </w:p>
     <w:p>
@@ -10403,7 +10403,7 @@
           <w:i w:val="0"/>
           <w:sz w:val="22"/>
         </w:rPr>
-        <w:t>The predictions are sensible: the young part-time service worker and the widowed respondent with limited education are confidently &lt;=50K, while the self-employed executive with a $15,024 capital gain is &gt;50K at probability 0.9996. Sample 4 is the unseen-category case and sample 5 is the missing-field case; both returned 200 with a usable answer and an explicit warning.</w:t>
+        <w:t>The predictions are sensible: the young part-time service worker and the widowed respondent with limited education are confidently &lt;=50K, while the self-employed executive with a $15,024 capital gain is &gt;50K at probability 0.9996. Sample 4 is the unseen-category case and sample 5 is the missing-field case. Both returned 200 with a usable answer and an explicit warning.</w:t>
       </w:r>
     </w:p>
     <w:p>
@@ -10701,7 +10701,7 @@
           <w:i w:val="0"/>
           <w:sz w:val="22"/>
         </w:rPr>
-        <w:t>Average end-to-end latency is 4.913 ms per request, of which 3.809 ms is the model and its preprocessing and 1.103 ms is HTTP and JSON overhead. The batch endpoint amortises that overhead: 5 records cost 1.094 ms each. Nearly all of the server-side cost is evaluating 2,770 boosted trees - the same cost that made AutoML 3x slower than the network in Step 4.</w:t>
+        <w:t>Average end-to-end latency is 4.913 ms per request, of which 3.809 ms is the model and its preprocessing and 1.103 ms is HTTP and JSON overhead. The batch endpoint amortises that overhead: 5 records cost 1.094 ms each. Nearly all of the server-side cost is evaluating 2,770 boosted trees. That is the same cost that made AutoML 3x slower than the network in Step 4.</w:t>
       </w:r>
     </w:p>
     <w:p>
@@ -10732,7 +10732,7 @@
           <w:i w:val="0"/>
           <w:sz w:val="22"/>
         </w:rPr>
-        <w:t>Case 1 - an unseen value in a known column (e.g. native-country='Wakanda').</w:t>
+        <w:t>Case 1. An unseen value in a known column (e.g. native-country='Wakanda').</w:t>
       </w:r>
     </w:p>
     <w:p>
@@ -10762,7 +10762,7 @@
           <w:i w:val="0"/>
           <w:sz w:val="22"/>
         </w:rPr>
-        <w:t>Case 2 - a missing or malformed value.</w:t>
+        <w:t>Case 2. A missing or malformed value.</w:t>
       </w:r>
     </w:p>
     <w:p>
@@ -10782,7 +10782,7 @@
           <w:i w:val="0"/>
           <w:sz w:val="22"/>
         </w:rPr>
-        <w:t>Case 3 - an entirely new column the model was never trained on.</w:t>
+        <w:t>Case 3. An entirely new column the model was never trained on.</w:t>
       </w:r>
     </w:p>
     <w:p>
@@ -10792,7 +10792,7 @@
           <w:i w:val="0"/>
           <w:sz w:val="22"/>
         </w:rPr>
-        <w:t>This one cannot be solved at inference time and should not be papered over. The ColumnTransformer selects columns by name, so an extra field is ignored and a missing required field is imputed; the request still succeeds. But a genuinely new predictive feature is information the model has no parameters for, and the only correct response is to retrain. In a production setting I would: version the input schema and reject requests whose schema version is unknown rather than guessing; log the rate of unseen categories and out-of-range values per feature as a drift signal; alarm when that rate crosses a threshold, because a spike usually means an upstream system changed its encoding, not that the world changed; and retrain on a schedule with the new column included. The warnings my predict function already returns are the raw material for exactly that monitoring.</w:t>
+        <w:t>This one cannot be solved at inference time and should not be papered over. The ColumnTransformer selects columns by name, so an extra field is ignored and a missing required field is imputed, and the request still succeeds. But a genuinely new predictive feature is information the model has no parameters for, and the only correct response is to retrain. In a production setting I would: version the input schema and reject requests whose schema version is unknown rather than guessing. I would log the rate of unseen categories and out-of-range values per feature as a drift signal, then alarm when that rate crosses a threshold, because a spike usually means an upstream system changed its encoding, not that the world changed. I would retrain on a schedule with the new column included. The warnings my predict function already returns are the raw material for exactly that monitoring.</w:t>
       </w:r>
     </w:p>
     <w:p>
@@ -10864,7 +10864,7 @@
           <w:i/>
           <w:sz w:val="18"/>
         </w:rPr>
-        <w:t>Screenshot 1 - uvicorn serving the model on 127.0.0.1:8000, with the startup log confirming which bundle was loaded and live request lines below.</w:t>
+        <w:t>Screenshot 1. Uvicorn serving the model on 127.0.0.1:8000, with the startup log confirming which bundle was loaded and live request lines below.</w:t>
       </w:r>
     </w:p>
     <w:p>
@@ -10915,7 +10915,7 @@
           <w:i/>
           <w:sz w:val="18"/>
         </w:rPr>
-        <w:t>Screenshot 2 - the auto-generated Swagger UI at /docs showing all four endpoints.</w:t>
+        <w:t>Screenshot 2. The auto-generated Swagger UI at /docs showing all four endpoints.</w:t>
       </w:r>
     </w:p>
     <w:p>
@@ -10966,7 +10966,7 @@
           <w:i/>
           <w:sz w:val="18"/>
         </w:rPr>
-        <w:t>Screenshot 3 - a real POST /predict executed from the browser: the senior executive record returns &gt;50K at probability 0.9996.</w:t>
+        <w:t>Screenshot 3. A real POST /predict executed from the browser: the senior executive record returns &gt;50K at probability 0.9996.</w:t>
       </w:r>
     </w:p>
     <w:p>
@@ -11017,7 +11017,7 @@
           <w:i/>
           <w:sz w:val="18"/>
         </w:rPr>
-        <w:t>Screenshot 4 - the unseen-category case executed live: native-country='Wakanda' returns HTTP 200 with a prediction and an explicit unseen_categories warning.</w:t>
+        <w:t>Screenshot 4. The unseen-category case executed live: native-country='Wakanda' returns HTTP 200 with a prediction and an explicit unseen_categories warning.</w:t>
       </w:r>
     </w:p>
     <w:p>
@@ -11068,7 +11068,7 @@
           <w:i/>
           <w:sz w:val="18"/>
         </w:rPr>
-        <w:t>Screenshot 5 - client_demo.py driving the live API: five predictions and the end-to-end latency measurement.</w:t>
+        <w:t>Screenshot 5. Client_demo.py driving the live API: five predictions and the end-to-end latency measurement.</w:t>
       </w:r>
     </w:p>
     <w:p>
@@ -11119,7 +11119,7 @@
           <w:i/>
           <w:sz w:val="18"/>
         </w:rPr>
-        <w:t>Screenshot 6 - the /health endpoint reporting the loaded model and its test ROC-AUC.</w:t>
+        <w:t>Screenshot 6. The /health endpoint reporting the loaded model and its test ROC-AUC.</w:t>
       </w:r>
     </w:p>
     <w:p>
@@ -11231,7 +11231,7 @@
         <w:pStyle w:val="ListContinue"/>
       </w:pPr>
       <w:r>
-        <w:t>At 24/76 imbalance, accuracy is dominated by the majority class - a model predicting '&lt;=50K' always scores 76%. ROC-AUC measures ranking quality independent of both the threshold and the class ratio.</w:t>
+        <w:t>At 24/76 imbalance, accuracy is dominated by the majority class. A model predicting '&lt;=50K' always scores 76%. ROC-AUC measures ranking quality independent of both the threshold and the class ratio.</w:t>
       </w:r>
     </w:p>
     <w:p>
@@ -11279,7 +11279,7 @@
         <w:pStyle w:val="ListContinue"/>
       </w:pPr>
       <w:r>
-        <w:t>The service is a localhost/Colab demo. Both models are small enough that CPU inference is the realistic serving mode; a GPU would change the absolute numbers but would favour the network, so my latency comparison is if anything conservative toward AutoML.</w:t>
+        <w:t>The service is a localhost/Colab demo. Both models are small enough that CPU inference is the realistic serving mode. A GPU would change the absolute numbers but would favour the network, so my latency comparison is if anything conservative toward AutoML.</w:t>
       </w:r>
     </w:p>
     <w:p>
@@ -11417,7 +11417,7 @@
               <w:rPr>
                 <w:sz w:val="18"/>
               </w:rPr>
-              <w:t>The environment available; every library below supports it.</w:t>
+              <w:t>The environment available. Every library below supports it.</w:t>
             </w:r>
           </w:p>
         </w:tc>
@@ -11499,7 +11499,7 @@
               <w:rPr>
                 <w:sz w:val="18"/>
               </w:rPr>
-              <w:t>ColumnTransformer + Pipeline give one fitted object that carries every preprocessing decision, which is what makes the Step-5 export honest - the served pipeline is literally the fitted training pipeline. Also provides stratified splitting and all the metrics.</w:t>
+              <w:t>ColumnTransformer + Pipeline give one fitted object that carries every preprocessing decision, which is what makes the Step-5 export honest. The served pipeline is literally the fitted training pipeline. Also provides stratified splitting and all the metrics.</w:t>
             </w:r>
           </w:p>
         </w:tc>
@@ -11540,7 +11540,7 @@
               <w:rPr>
                 <w:sz w:val="18"/>
               </w:rPr>
-              <w:t>Installs cleanly on Python 3.9 / Apple Silicon (auto-sklearn does not); takes an explicit time budget, making the training-time comparison bounded and meaningful; lighter than AutoGluon, whose default stacked ensembles would have confounded 'AutoML found a better model' with 'an ensemble of twenty models beats one model'.</w:t>
+              <w:t>Installs cleanly on Python 3.9 / Apple Silicon, where auto-sklearn does not. It takes an explicit time budget, making the training-time comparison bounded and meaningful. It is lighter than AutoGluon, whose default stacked ensembles would have confounded 'AutoML found a better model' with 'an ensemble of twenty models beats one model'.</w:t>
             </w:r>
           </w:p>
         </w:tc>
@@ -11993,7 +11993,7 @@
         <w:pStyle w:val="ListBullet"/>
       </w:pPr>
       <w:r>
-        <w:t>Measure the noise floor before claiming a factor matters. My first tuning table looked like five factors with tiny differences; retraining one configuration under three seeds showed that four of those differences were smaller than random variation. Without that check I would have confidently reported a ranking of pure noise.</w:t>
+        <w:t>Measure the noise floor before claiming a factor matters. My first tuning table looked like five factors with tiny differences. Retraining one configuration under three seeds showed that four of those differences were smaller than random variation. Without that check I would have confidently reported a ranking of pure noise.</w:t>
       </w:r>
     </w:p>
     <w:p>
@@ -12017,7 +12017,7 @@
         <w:pStyle w:val="ListBullet"/>
       </w:pPr>
       <w:r>
-        <w:t>Accuracy is not the whole decision. AutoML won on quality; the network won on size, latency and search cost. Which one I would actually ship depends on the serving budget, and I said so explicitly rather than treating the highest AUC as automatically correct.</w:t>
+        <w:t>Accuracy is not the whole decision. AutoML won on quality. The network won on size, latency and search cost. Which one I would actually ship depends on the serving budget, and I said so explicitly rather than treating the highest AUC as automatically correct.</w:t>
       </w:r>
     </w:p>
     <w:p>
@@ -12035,7 +12035,7 @@
           <w:i w:val="0"/>
           <w:sz w:val="22"/>
         </w:rPr>
-        <w:t>If I continued this work, the highest-value next steps would be threshold tuning against an explicit cost matrix (recall is the clear weak point of both models), feature engineering for the MLP - which is the sort of thing a network needs and trees do for free - and calibration analysis, since these probabilities are currently served to a caller without any check that they mean what they claim.</w:t>
+        <w:t>If I continued this work, the highest-value next steps would be threshold tuning against an explicit cost matrix (recall is the clear weak point of both models), feature engineering for the MLP, which is the sort of thing a network needs and trees do for free, and calibration analysis, since these probabilities are currently served to a caller without any check that they mean what they claim.</w:t>
       </w:r>
     </w:p>
     <w:sectPr>

</xml_diff>